<commit_message>
Update web page code
</commit_message>
<xml_diff>
--- a/Wireframe.docx
+++ b/Wireframe.docx
@@ -1,6 +1,6 @@
 
 <file path=word/document.xml><?xml version="1.0" encoding="utf-8"?>
-<w:document xmlns:wpc="http://schemas.microsoft.com/office/word/2010/wordprocessingCanvas" xmlns:cx="http://schemas.microsoft.com/office/drawing/2014/chartex" xmlns:cx1="http://schemas.microsoft.com/office/drawing/2015/9/8/chartex" xmlns:cx2="http://schemas.microsoft.com/office/drawing/2015/10/21/chartex" xmlns:cx3="http://schemas.microsoft.com/office/drawing/2016/5/9/chartex" xmlns:cx4="http://schemas.microsoft.com/office/drawing/2016/5/10/chartex" xmlns:cx5="http://schemas.microsoft.com/office/drawing/2016/5/11/chartex" xmlns:cx6="http://schemas.microsoft.com/office/drawing/2016/5/12/chartex" xmlns:cx7="http://schemas.microsoft.com/office/drawing/2016/5/13/chartex" xmlns:cx8="http://schemas.microsoft.com/office/drawing/2016/5/14/chartex" xmlns:mc="http://schemas.openxmlformats.org/markup-compatibility/2006" xmlns:aink="http://schemas.microsoft.com/office/drawing/2016/ink" xmlns:am3d="http://schemas.microsoft.com/office/drawing/2017/model3d" xmlns:o="urn:schemas-microsoft-com:office:office" xmlns:oel="http://schemas.microsoft.com/office/2019/extlst" xmlns:r="http://schemas.openxmlformats.org/officeDocument/2006/relationships" xmlns:m="http://schemas.openxmlformats.org/officeDocument/2006/math" xmlns:v="urn:schemas-microsoft-com:vml" xmlns:wp14="http://schemas.microsoft.com/office/word/2010/wordprocessingDrawing" xmlns:wp="http://schemas.openxmlformats.org/drawingml/2006/wordprocessingDrawing" xmlns:w10="urn:schemas-microsoft-com:office:word" xmlns:w="http://schemas.openxmlformats.org/wordprocessingml/2006/main" xmlns:w14="http://schemas.microsoft.com/office/word/2010/wordml" xmlns:w15="http://schemas.microsoft.com/office/word/2012/wordml" xmlns:w16cex="http://schemas.microsoft.com/office/word/2018/wordml/cex" xmlns:w16cid="http://schemas.microsoft.com/office/word/2016/wordml/cid" xmlns:w16="http://schemas.microsoft.com/office/word/2018/wordml" xmlns:w16du="http://schemas.microsoft.com/office/word/2023/wordml/word16du" xmlns:w16sdtdh="http://schemas.microsoft.com/office/word/2020/wordml/sdtdatahash" xmlns:w16sdtfl="http://schemas.microsoft.com/office/word/2024/wordml/sdtformatlock" xmlns:w16se="http://schemas.microsoft.com/office/word/2015/wordml/symex" xmlns:wpg="http://schemas.microsoft.com/office/word/2010/wordprocessingGroup" xmlns:wpi="http://schemas.microsoft.com/office/word/2010/wordprocessingInk" xmlns:wne="http://schemas.microsoft.com/office/word/2006/wordml" xmlns:wps="http://schemas.microsoft.com/office/word/2010/wordprocessingShape" mc:Ignorable="w14 w15 w16se w16cid w16 w16cex w16sdtdh w16sdtfl w16du wp14">
+<w:document xmlns:wpc="http://schemas.microsoft.com/office/word/2010/wordprocessingCanvas" xmlns:cx="http://schemas.microsoft.com/office/drawing/2014/chartex" xmlns:cx1="http://schemas.microsoft.com/office/drawing/2015/9/8/chartex" xmlns:cx2="http://schemas.microsoft.com/office/drawing/2015/10/21/chartex" xmlns:cx3="http://schemas.microsoft.com/office/drawing/2016/5/9/chartex" xmlns:cx4="http://schemas.microsoft.com/office/drawing/2016/5/10/chartex" xmlns:cx5="http://schemas.microsoft.com/office/drawing/2016/5/11/chartex" xmlns:cx6="http://schemas.microsoft.com/office/drawing/2016/5/12/chartex" xmlns:cx7="http://schemas.microsoft.com/office/drawing/2016/5/13/chartex" xmlns:cx8="http://schemas.microsoft.com/office/drawing/2016/5/14/chartex" xmlns:mc="http://schemas.openxmlformats.org/markup-compatibility/2006" xmlns:aink="http://schemas.microsoft.com/office/drawing/2016/ink" xmlns:am3d="http://schemas.microsoft.com/office/drawing/2017/model3d" xmlns:o="urn:schemas-microsoft-com:office:office" xmlns:oel="http://schemas.microsoft.com/office/2019/extlst" xmlns:r="http://schemas.openxmlformats.org/officeDocument/2006/relationships" xmlns:m="http://schemas.openxmlformats.org/officeDocument/2006/math" xmlns:v="urn:schemas-microsoft-com:vml" xmlns:wp14="http://schemas.microsoft.com/office/word/2010/wordprocessingDrawing" xmlns:wp="http://schemas.openxmlformats.org/drawingml/2006/wordprocessingDrawing" xmlns:w10="urn:schemas-microsoft-com:office:word" xmlns:w="http://schemas.openxmlformats.org/wordprocessingml/2006/main" xmlns:w14="http://schemas.microsoft.com/office/word/2010/wordml" xmlns:w15="http://schemas.microsoft.com/office/word/2012/wordml" xmlns:w16cei="http://schemas.microsoft.com/office/word/2026/wordml/cei" xmlns:w16cex="http://schemas.microsoft.com/office/word/2018/wordml/cex" xmlns:w16cid="http://schemas.microsoft.com/office/word/2016/wordml/cid" xmlns:w16="http://schemas.microsoft.com/office/word/2018/wordml" xmlns:w16du="http://schemas.microsoft.com/office/word/2023/wordml/word16du" xmlns:w16sdtdh="http://schemas.microsoft.com/office/word/2020/wordml/sdtdatahash" xmlns:w16sdtfl="http://schemas.microsoft.com/office/word/2024/wordml/sdtformatlock" xmlns:w16se="http://schemas.microsoft.com/office/word/2015/wordml/symex" xmlns:wpg="http://schemas.microsoft.com/office/word/2010/wordprocessingGroup" xmlns:wpi="http://schemas.microsoft.com/office/word/2010/wordprocessingInk" xmlns:wne="http://schemas.microsoft.com/office/word/2006/wordml" xmlns:wps="http://schemas.microsoft.com/office/word/2010/wordprocessingShape" mc:Ignorable="w14 w15 w16se w16cid w16 w16cex w16sdtdh w16sdtfl w16du wp14">
   <w:body>
     <w:p>
       <w:pPr>
@@ -35,6 +35,7 @@
         <w:rPr>
           <w:b/>
           <w:bCs/>
+          <w:noProof/>
           <w:lang w:val="en-US"/>
         </w:rPr>
         <w:drawing>
@@ -53,7 +54,7 @@
                     <pic:cNvPicPr/>
                   </pic:nvPicPr>
                   <pic:blipFill rotWithShape="1">
-                    <a:blip r:embed="rId4"/>
+                    <a:blip r:embed="rId6"/>
                     <a:srcRect l="5735"/>
                     <a:stretch>
                       <a:fillRect/>
@@ -112,6 +113,7 @@
         <w:rPr>
           <w:b/>
           <w:bCs/>
+          <w:noProof/>
           <w:lang w:val="en-US"/>
         </w:rPr>
         <w:drawing>
@@ -130,7 +132,7 @@
                     <pic:cNvPicPr/>
                   </pic:nvPicPr>
                   <pic:blipFill>
-                    <a:blip r:embed="rId5"/>
+                    <a:blip r:embed="rId7"/>
                     <a:stretch>
                       <a:fillRect/>
                     </a:stretch>
@@ -163,6 +165,7 @@
         <w:rPr>
           <w:b/>
           <w:bCs/>
+          <w:noProof/>
           <w:lang w:val="en-US"/>
         </w:rPr>
         <w:drawing>
@@ -181,7 +184,7 @@
                     <pic:cNvPicPr/>
                   </pic:nvPicPr>
                   <pic:blipFill>
-                    <a:blip r:embed="rId6"/>
+                    <a:blip r:embed="rId8"/>
                     <a:stretch>
                       <a:fillRect/>
                     </a:stretch>
@@ -214,6 +217,7 @@
         <w:rPr>
           <w:b/>
           <w:bCs/>
+          <w:noProof/>
           <w:lang w:val="en-US"/>
         </w:rPr>
         <w:lastRenderedPageBreak/>
@@ -233,7 +237,7 @@
                     <pic:cNvPicPr/>
                   </pic:nvPicPr>
                   <pic:blipFill>
-                    <a:blip r:embed="rId7"/>
+                    <a:blip r:embed="rId9"/>
                     <a:stretch>
                       <a:fillRect/>
                     </a:stretch>
@@ -266,6 +270,7 @@
         <w:rPr>
           <w:b/>
           <w:bCs/>
+          <w:noProof/>
           <w:lang w:val="en-US"/>
         </w:rPr>
         <w:drawing>
@@ -284,7 +289,7 @@
                     <pic:cNvPicPr/>
                   </pic:nvPicPr>
                   <pic:blipFill>
-                    <a:blip r:embed="rId8"/>
+                    <a:blip r:embed="rId10"/>
                     <a:stretch>
                       <a:fillRect/>
                     </a:stretch>
@@ -317,6 +322,7 @@
         <w:rPr>
           <w:b/>
           <w:bCs/>
+          <w:noProof/>
           <w:lang w:val="en-US"/>
         </w:rPr>
         <w:drawing>
@@ -335,7 +341,7 @@
                     <pic:cNvPicPr/>
                   </pic:nvPicPr>
                   <pic:blipFill>
-                    <a:blip r:embed="rId9"/>
+                    <a:blip r:embed="rId11"/>
                     <a:stretch>
                       <a:fillRect/>
                     </a:stretch>
@@ -368,6 +374,7 @@
         <w:rPr>
           <w:b/>
           <w:bCs/>
+          <w:noProof/>
           <w:lang w:val="en-US"/>
         </w:rPr>
         <w:lastRenderedPageBreak/>
@@ -387,7 +394,7 @@
                     <pic:cNvPicPr/>
                   </pic:nvPicPr>
                   <pic:blipFill>
-                    <a:blip r:embed="rId10"/>
+                    <a:blip r:embed="rId12"/>
                     <a:stretch>
                       <a:fillRect/>
                     </a:stretch>
@@ -429,6 +436,7 @@
         <w:rPr>
           <w:b/>
           <w:bCs/>
+          <w:noProof/>
           <w:lang w:val="en-US"/>
         </w:rPr>
         <w:drawing>
@@ -447,7 +455,7 @@
                     <pic:cNvPicPr/>
                   </pic:nvPicPr>
                   <pic:blipFill>
-                    <a:blip r:embed="rId11"/>
+                    <a:blip r:embed="rId13"/>
                     <a:stretch>
                       <a:fillRect/>
                     </a:stretch>
@@ -480,6 +488,7 @@
         <w:rPr>
           <w:b/>
           <w:bCs/>
+          <w:noProof/>
           <w:lang w:val="en-US"/>
         </w:rPr>
         <w:drawing>
@@ -498,7 +507,7 @@
                     <pic:cNvPicPr/>
                   </pic:nvPicPr>
                   <pic:blipFill>
-                    <a:blip r:embed="rId12"/>
+                    <a:blip r:embed="rId14"/>
                     <a:stretch>
                       <a:fillRect/>
                     </a:stretch>
@@ -531,6 +540,7 @@
         <w:rPr>
           <w:b/>
           <w:bCs/>
+          <w:noProof/>
           <w:lang w:val="en-US"/>
         </w:rPr>
         <w:lastRenderedPageBreak/>
@@ -550,7 +560,7 @@
                     <pic:cNvPicPr/>
                   </pic:nvPicPr>
                   <pic:blipFill>
-                    <a:blip r:embed="rId13"/>
+                    <a:blip r:embed="rId15"/>
                     <a:stretch>
                       <a:fillRect/>
                     </a:stretch>
@@ -583,6 +593,7 @@
         <w:rPr>
           <w:b/>
           <w:bCs/>
+          <w:noProof/>
           <w:lang w:val="en-US"/>
         </w:rPr>
         <w:drawing>
@@ -601,7 +612,7 @@
                     <pic:cNvPicPr/>
                   </pic:nvPicPr>
                   <pic:blipFill>
-                    <a:blip r:embed="rId14"/>
+                    <a:blip r:embed="rId16"/>
                     <a:stretch>
                       <a:fillRect/>
                     </a:stretch>
@@ -634,6 +645,7 @@
         <w:rPr>
           <w:b/>
           <w:bCs/>
+          <w:noProof/>
           <w:lang w:val="en-US"/>
         </w:rPr>
         <w:drawing>
@@ -652,7 +664,7 @@
                     <pic:cNvPicPr/>
                   </pic:nvPicPr>
                   <pic:blipFill>
-                    <a:blip r:embed="rId15"/>
+                    <a:blip r:embed="rId17"/>
                     <a:stretch>
                       <a:fillRect/>
                     </a:stretch>
@@ -685,6 +697,7 @@
         <w:rPr>
           <w:b/>
           <w:bCs/>
+          <w:noProof/>
           <w:lang w:val="en-US"/>
         </w:rPr>
         <w:lastRenderedPageBreak/>
@@ -704,7 +717,7 @@
                     <pic:cNvPicPr/>
                   </pic:nvPicPr>
                   <pic:blipFill>
-                    <a:blip r:embed="rId16"/>
+                    <a:blip r:embed="rId18"/>
                     <a:stretch>
                       <a:fillRect/>
                     </a:stretch>
@@ -737,6 +750,7 @@
         <w:rPr>
           <w:b/>
           <w:bCs/>
+          <w:noProof/>
           <w:lang w:val="en-US"/>
         </w:rPr>
         <w:drawing>
@@ -755,7 +769,7 @@
                     <pic:cNvPicPr/>
                   </pic:nvPicPr>
                   <pic:blipFill>
-                    <a:blip r:embed="rId17"/>
+                    <a:blip r:embed="rId19"/>
                     <a:stretch>
                       <a:fillRect/>
                     </a:stretch>
@@ -788,6 +802,7 @@
         <w:rPr>
           <w:b/>
           <w:bCs/>
+          <w:noProof/>
           <w:lang w:val="en-US"/>
         </w:rPr>
         <w:drawing>
@@ -806,7 +821,7 @@
                     <pic:cNvPicPr/>
                   </pic:nvPicPr>
                   <pic:blipFill>
-                    <a:blip r:embed="rId18"/>
+                    <a:blip r:embed="rId20"/>
                     <a:stretch>
                       <a:fillRect/>
                     </a:stretch>
@@ -837,6 +852,8 @@
       </w:pPr>
     </w:p>
     <w:sectPr>
+      <w:headerReference w:type="default" r:id="rId21"/>
+      <w:footerReference w:type="default" r:id="rId22"/>
       <w:pgSz w:w="11906" w:h="16838"/>
       <w:pgMar w:top="1440" w:right="1440" w:bottom="1440" w:left="1440" w:header="708" w:footer="708" w:gutter="0"/>
       <w:cols w:space="708"/>
@@ -844,6 +861,139 @@
     </w:sectPr>
   </w:body>
 </w:document>
+</file>
+
+<file path=word/endnotes.xml><?xml version="1.0" encoding="utf-8"?>
+<w:endnotes xmlns:wpc="http://schemas.microsoft.com/office/word/2010/wordprocessingCanvas" xmlns:cx="http://schemas.microsoft.com/office/drawing/2014/chartex" xmlns:cx1="http://schemas.microsoft.com/office/drawing/2015/9/8/chartex" xmlns:cx2="http://schemas.microsoft.com/office/drawing/2015/10/21/chartex" xmlns:cx3="http://schemas.microsoft.com/office/drawing/2016/5/9/chartex" xmlns:cx4="http://schemas.microsoft.com/office/drawing/2016/5/10/chartex" xmlns:cx5="http://schemas.microsoft.com/office/drawing/2016/5/11/chartex" xmlns:cx6="http://schemas.microsoft.com/office/drawing/2016/5/12/chartex" xmlns:cx7="http://schemas.microsoft.com/office/drawing/2016/5/13/chartex" xmlns:cx8="http://schemas.microsoft.com/office/drawing/2016/5/14/chartex" xmlns:mc="http://schemas.openxmlformats.org/markup-compatibility/2006" xmlns:aink="http://schemas.microsoft.com/office/drawing/2016/ink" xmlns:am3d="http://schemas.microsoft.com/office/drawing/2017/model3d" xmlns:o="urn:schemas-microsoft-com:office:office" xmlns:oel="http://schemas.microsoft.com/office/2019/extlst" xmlns:r="http://schemas.openxmlformats.org/officeDocument/2006/relationships" xmlns:m="http://schemas.openxmlformats.org/officeDocument/2006/math" xmlns:v="urn:schemas-microsoft-com:vml" xmlns:wp14="http://schemas.microsoft.com/office/word/2010/wordprocessingDrawing" xmlns:wp="http://schemas.openxmlformats.org/drawingml/2006/wordprocessingDrawing" xmlns:w10="urn:schemas-microsoft-com:office:word" xmlns:w="http://schemas.openxmlformats.org/wordprocessingml/2006/main" xmlns:w14="http://schemas.microsoft.com/office/word/2010/wordml" xmlns:w15="http://schemas.microsoft.com/office/word/2012/wordml" xmlns:w16cei="http://schemas.microsoft.com/office/word/2026/wordml/cei" xmlns:w16cex="http://schemas.microsoft.com/office/word/2018/wordml/cex" xmlns:w16cid="http://schemas.microsoft.com/office/word/2016/wordml/cid" xmlns:w16="http://schemas.microsoft.com/office/word/2018/wordml" xmlns:w16du="http://schemas.microsoft.com/office/word/2023/wordml/word16du" xmlns:w16sdtdh="http://schemas.microsoft.com/office/word/2020/wordml/sdtdatahash" xmlns:w16sdtfl="http://schemas.microsoft.com/office/word/2024/wordml/sdtformatlock" xmlns:w16se="http://schemas.microsoft.com/office/word/2015/wordml/symex" xmlns:wpg="http://schemas.microsoft.com/office/word/2010/wordprocessingGroup" xmlns:wpi="http://schemas.microsoft.com/office/word/2010/wordprocessingInk" xmlns:wne="http://schemas.microsoft.com/office/word/2006/wordml" xmlns:wps="http://schemas.microsoft.com/office/word/2010/wordprocessingShape" mc:Ignorable="w14 w15 w16se w16cid w16 w16cex w16sdtdh w16sdtfl w16du wp14">
+  <w:endnote w:type="separator" w:id="-1">
+    <w:p>
+      <w:pPr>
+        <w:spacing w:after="0" w:line="240" w:lineRule="auto"/>
+      </w:pPr>
+      <w:r>
+        <w:separator/>
+      </w:r>
+    </w:p>
+  </w:endnote>
+  <w:endnote w:type="continuationSeparator" w:id="0">
+    <w:p>
+      <w:pPr>
+        <w:spacing w:after="0" w:line="240" w:lineRule="auto"/>
+      </w:pPr>
+      <w:r>
+        <w:continuationSeparator/>
+      </w:r>
+    </w:p>
+  </w:endnote>
+</w:endnotes>
+</file>
+
+<file path=word/footer1.xml><?xml version="1.0" encoding="utf-8"?>
+<w:ftr xmlns:wpc="http://schemas.microsoft.com/office/word/2010/wordprocessingCanvas" xmlns:cx="http://schemas.microsoft.com/office/drawing/2014/chartex" xmlns:cx1="http://schemas.microsoft.com/office/drawing/2015/9/8/chartex" xmlns:cx2="http://schemas.microsoft.com/office/drawing/2015/10/21/chartex" xmlns:cx3="http://schemas.microsoft.com/office/drawing/2016/5/9/chartex" xmlns:cx4="http://schemas.microsoft.com/office/drawing/2016/5/10/chartex" xmlns:cx5="http://schemas.microsoft.com/office/drawing/2016/5/11/chartex" xmlns:cx6="http://schemas.microsoft.com/office/drawing/2016/5/12/chartex" xmlns:cx7="http://schemas.microsoft.com/office/drawing/2016/5/13/chartex" xmlns:cx8="http://schemas.microsoft.com/office/drawing/2016/5/14/chartex" xmlns:mc="http://schemas.openxmlformats.org/markup-compatibility/2006" xmlns:aink="http://schemas.microsoft.com/office/drawing/2016/ink" xmlns:am3d="http://schemas.microsoft.com/office/drawing/2017/model3d" xmlns:o="urn:schemas-microsoft-com:office:office" xmlns:oel="http://schemas.microsoft.com/office/2019/extlst" xmlns:r="http://schemas.openxmlformats.org/officeDocument/2006/relationships" xmlns:m="http://schemas.openxmlformats.org/officeDocument/2006/math" xmlns:v="urn:schemas-microsoft-com:vml" xmlns:wp14="http://schemas.microsoft.com/office/word/2010/wordprocessingDrawing" xmlns:wp="http://schemas.openxmlformats.org/drawingml/2006/wordprocessingDrawing" xmlns:w10="urn:schemas-microsoft-com:office:word" xmlns:w="http://schemas.openxmlformats.org/wordprocessingml/2006/main" xmlns:w14="http://schemas.microsoft.com/office/word/2010/wordml" xmlns:w15="http://schemas.microsoft.com/office/word/2012/wordml" xmlns:w16cei="http://schemas.microsoft.com/office/word/2026/wordml/cei" xmlns:w16cex="http://schemas.microsoft.com/office/word/2018/wordml/cex" xmlns:w16cid="http://schemas.microsoft.com/office/word/2016/wordml/cid" xmlns:w16="http://schemas.microsoft.com/office/word/2018/wordml" xmlns:w16du="http://schemas.microsoft.com/office/word/2023/wordml/word16du" xmlns:w16sdtdh="http://schemas.microsoft.com/office/word/2020/wordml/sdtdatahash" xmlns:w16sdtfl="http://schemas.microsoft.com/office/word/2024/wordml/sdtformatlock" xmlns:w16se="http://schemas.microsoft.com/office/word/2015/wordml/symex" xmlns:wpg="http://schemas.microsoft.com/office/word/2010/wordprocessingGroup" xmlns:wpi="http://schemas.microsoft.com/office/word/2010/wordprocessingInk" xmlns:wne="http://schemas.microsoft.com/office/word/2006/wordml" xmlns:wps="http://schemas.microsoft.com/office/word/2010/wordprocessingShape" mc:Ignorable="w14 w15 w16se w16cid w16 w16cex w16sdtdh w16sdtfl w16du wp14">
+  <w:p>
+    <w:pPr>
+      <w:pStyle w:val="Footer"/>
+      <w:jc w:val="center"/>
+      <w:rPr>
+        <w:caps/>
+        <w:noProof/>
+        <w:color w:val="156082" w:themeColor="accent1"/>
+      </w:rPr>
+    </w:pPr>
+    <w:r>
+      <w:rPr>
+        <w:caps/>
+        <w:color w:val="156082" w:themeColor="accent1"/>
+      </w:rPr>
+      <w:fldChar w:fldCharType="begin"/>
+    </w:r>
+    <w:r>
+      <w:rPr>
+        <w:caps/>
+        <w:color w:val="156082" w:themeColor="accent1"/>
+      </w:rPr>
+      <w:instrText xml:space="preserve"> PAGE   \* MERGEFORMAT </w:instrText>
+    </w:r>
+    <w:r>
+      <w:rPr>
+        <w:caps/>
+        <w:color w:val="156082" w:themeColor="accent1"/>
+      </w:rPr>
+      <w:fldChar w:fldCharType="separate"/>
+    </w:r>
+    <w:r>
+      <w:rPr>
+        <w:caps/>
+        <w:noProof/>
+        <w:color w:val="156082" w:themeColor="accent1"/>
+      </w:rPr>
+      <w:t>2</w:t>
+    </w:r>
+    <w:r>
+      <w:rPr>
+        <w:caps/>
+        <w:noProof/>
+        <w:color w:val="156082" w:themeColor="accent1"/>
+      </w:rPr>
+      <w:fldChar w:fldCharType="end"/>
+    </w:r>
+  </w:p>
+  <w:p>
+    <w:pPr>
+      <w:pStyle w:val="Footer"/>
+    </w:pPr>
+  </w:p>
+</w:ftr>
+</file>
+
+<file path=word/footnotes.xml><?xml version="1.0" encoding="utf-8"?>
+<w:footnotes xmlns:wpc="http://schemas.microsoft.com/office/word/2010/wordprocessingCanvas" xmlns:cx="http://schemas.microsoft.com/office/drawing/2014/chartex" xmlns:cx1="http://schemas.microsoft.com/office/drawing/2015/9/8/chartex" xmlns:cx2="http://schemas.microsoft.com/office/drawing/2015/10/21/chartex" xmlns:cx3="http://schemas.microsoft.com/office/drawing/2016/5/9/chartex" xmlns:cx4="http://schemas.microsoft.com/office/drawing/2016/5/10/chartex" xmlns:cx5="http://schemas.microsoft.com/office/drawing/2016/5/11/chartex" xmlns:cx6="http://schemas.microsoft.com/office/drawing/2016/5/12/chartex" xmlns:cx7="http://schemas.microsoft.com/office/drawing/2016/5/13/chartex" xmlns:cx8="http://schemas.microsoft.com/office/drawing/2016/5/14/chartex" xmlns:mc="http://schemas.openxmlformats.org/markup-compatibility/2006" xmlns:aink="http://schemas.microsoft.com/office/drawing/2016/ink" xmlns:am3d="http://schemas.microsoft.com/office/drawing/2017/model3d" xmlns:o="urn:schemas-microsoft-com:office:office" xmlns:oel="http://schemas.microsoft.com/office/2019/extlst" xmlns:r="http://schemas.openxmlformats.org/officeDocument/2006/relationships" xmlns:m="http://schemas.openxmlformats.org/officeDocument/2006/math" xmlns:v="urn:schemas-microsoft-com:vml" xmlns:wp14="http://schemas.microsoft.com/office/word/2010/wordprocessingDrawing" xmlns:wp="http://schemas.openxmlformats.org/drawingml/2006/wordprocessingDrawing" xmlns:w10="urn:schemas-microsoft-com:office:word" xmlns:w="http://schemas.openxmlformats.org/wordprocessingml/2006/main" xmlns:w14="http://schemas.microsoft.com/office/word/2010/wordml" xmlns:w15="http://schemas.microsoft.com/office/word/2012/wordml" xmlns:w16cei="http://schemas.microsoft.com/office/word/2026/wordml/cei" xmlns:w16cex="http://schemas.microsoft.com/office/word/2018/wordml/cex" xmlns:w16cid="http://schemas.microsoft.com/office/word/2016/wordml/cid" xmlns:w16="http://schemas.microsoft.com/office/word/2018/wordml" xmlns:w16du="http://schemas.microsoft.com/office/word/2023/wordml/word16du" xmlns:w16sdtdh="http://schemas.microsoft.com/office/word/2020/wordml/sdtdatahash" xmlns:w16sdtfl="http://schemas.microsoft.com/office/word/2024/wordml/sdtformatlock" xmlns:w16se="http://schemas.microsoft.com/office/word/2015/wordml/symex" xmlns:wpg="http://schemas.microsoft.com/office/word/2010/wordprocessingGroup" xmlns:wpi="http://schemas.microsoft.com/office/word/2010/wordprocessingInk" xmlns:wne="http://schemas.microsoft.com/office/word/2006/wordml" xmlns:wps="http://schemas.microsoft.com/office/word/2010/wordprocessingShape" mc:Ignorable="w14 w15 w16se w16cid w16 w16cex w16sdtdh w16sdtfl w16du wp14">
+  <w:footnote w:type="separator" w:id="-1">
+    <w:p>
+      <w:pPr>
+        <w:spacing w:after="0" w:line="240" w:lineRule="auto"/>
+      </w:pPr>
+      <w:r>
+        <w:separator/>
+      </w:r>
+    </w:p>
+  </w:footnote>
+  <w:footnote w:type="continuationSeparator" w:id="0">
+    <w:p>
+      <w:pPr>
+        <w:spacing w:after="0" w:line="240" w:lineRule="auto"/>
+      </w:pPr>
+      <w:r>
+        <w:continuationSeparator/>
+      </w:r>
+    </w:p>
+  </w:footnote>
+</w:footnotes>
+</file>
+
+<file path=word/header1.xml><?xml version="1.0" encoding="utf-8"?>
+<w:hdr xmlns:wpc="http://schemas.microsoft.com/office/word/2010/wordprocessingCanvas" xmlns:cx="http://schemas.microsoft.com/office/drawing/2014/chartex" xmlns:cx1="http://schemas.microsoft.com/office/drawing/2015/9/8/chartex" xmlns:cx2="http://schemas.microsoft.com/office/drawing/2015/10/21/chartex" xmlns:cx3="http://schemas.microsoft.com/office/drawing/2016/5/9/chartex" xmlns:cx4="http://schemas.microsoft.com/office/drawing/2016/5/10/chartex" xmlns:cx5="http://schemas.microsoft.com/office/drawing/2016/5/11/chartex" xmlns:cx6="http://schemas.microsoft.com/office/drawing/2016/5/12/chartex" xmlns:cx7="http://schemas.microsoft.com/office/drawing/2016/5/13/chartex" xmlns:cx8="http://schemas.microsoft.com/office/drawing/2016/5/14/chartex" xmlns:mc="http://schemas.openxmlformats.org/markup-compatibility/2006" xmlns:aink="http://schemas.microsoft.com/office/drawing/2016/ink" xmlns:am3d="http://schemas.microsoft.com/office/drawing/2017/model3d" xmlns:o="urn:schemas-microsoft-com:office:office" xmlns:oel="http://schemas.microsoft.com/office/2019/extlst" xmlns:r="http://schemas.openxmlformats.org/officeDocument/2006/relationships" xmlns:m="http://schemas.openxmlformats.org/officeDocument/2006/math" xmlns:v="urn:schemas-microsoft-com:vml" xmlns:wp14="http://schemas.microsoft.com/office/word/2010/wordprocessingDrawing" xmlns:wp="http://schemas.openxmlformats.org/drawingml/2006/wordprocessingDrawing" xmlns:w10="urn:schemas-microsoft-com:office:word" xmlns:w="http://schemas.openxmlformats.org/wordprocessingml/2006/main" xmlns:w14="http://schemas.microsoft.com/office/word/2010/wordml" xmlns:w15="http://schemas.microsoft.com/office/word/2012/wordml" xmlns:w16cei="http://schemas.microsoft.com/office/word/2026/wordml/cei" xmlns:w16cex="http://schemas.microsoft.com/office/word/2018/wordml/cex" xmlns:w16cid="http://schemas.microsoft.com/office/word/2016/wordml/cid" xmlns:w16="http://schemas.microsoft.com/office/word/2018/wordml" xmlns:w16du="http://schemas.microsoft.com/office/word/2023/wordml/word16du" xmlns:w16sdtdh="http://schemas.microsoft.com/office/word/2020/wordml/sdtdatahash" xmlns:w16sdtfl="http://schemas.microsoft.com/office/word/2024/wordml/sdtformatlock" xmlns:w16se="http://schemas.microsoft.com/office/word/2015/wordml/symex" xmlns:wpg="http://schemas.microsoft.com/office/word/2010/wordprocessingGroup" xmlns:wpi="http://schemas.microsoft.com/office/word/2010/wordprocessingInk" xmlns:wne="http://schemas.microsoft.com/office/word/2006/wordml" xmlns:wps="http://schemas.microsoft.com/office/word/2010/wordprocessingShape" mc:Ignorable="w14 w15 w16se w16cid w16 w16cex w16sdtdh w16sdtfl w16du wp14">
+  <w:p>
+    <w:pPr>
+      <w:pStyle w:val="Header"/>
+    </w:pPr>
+    <w:r>
+      <w:t>DEPSTAR</w:t>
+    </w:r>
+    <w:r>
+      <w:tab/>
+    </w:r>
+    <w:r>
+      <w:tab/>
+      <w:t>25DCE114</w:t>
+    </w:r>
+  </w:p>
+  <w:p>
+    <w:pPr>
+      <w:pStyle w:val="Header"/>
+    </w:pPr>
+  </w:p>
+</w:hdr>
 </file>
 
 <file path=word/styles.xml><?xml version="1.0" encoding="utf-8"?>
@@ -1763,6 +1913,50 @@
       <w:spacing w:val="5"/>
     </w:rPr>
   </w:style>
+  <w:style w:type="paragraph" w:styleId="Header">
+    <w:name w:val="header"/>
+    <w:basedOn w:val="Normal"/>
+    <w:link w:val="HeaderChar"/>
+    <w:uiPriority w:val="99"/>
+    <w:unhideWhenUsed/>
+    <w:rsid w:val="00A235BC"/>
+    <w:pPr>
+      <w:tabs>
+        <w:tab w:val="center" w:pos="4513"/>
+        <w:tab w:val="right" w:pos="9026"/>
+      </w:tabs>
+      <w:spacing w:after="0" w:line="240" w:lineRule="auto"/>
+    </w:pPr>
+  </w:style>
+  <w:style w:type="character" w:customStyle="1" w:styleId="HeaderChar">
+    <w:name w:val="Header Char"/>
+    <w:basedOn w:val="DefaultParagraphFont"/>
+    <w:link w:val="Header"/>
+    <w:uiPriority w:val="99"/>
+    <w:rsid w:val="00A235BC"/>
+  </w:style>
+  <w:style w:type="paragraph" w:styleId="Footer">
+    <w:name w:val="footer"/>
+    <w:basedOn w:val="Normal"/>
+    <w:link w:val="FooterChar"/>
+    <w:uiPriority w:val="99"/>
+    <w:unhideWhenUsed/>
+    <w:rsid w:val="00A235BC"/>
+    <w:pPr>
+      <w:tabs>
+        <w:tab w:val="center" w:pos="4513"/>
+        <w:tab w:val="right" w:pos="9026"/>
+      </w:tabs>
+      <w:spacing w:after="0" w:line="240" w:lineRule="auto"/>
+    </w:pPr>
+  </w:style>
+  <w:style w:type="character" w:customStyle="1" w:styleId="FooterChar">
+    <w:name w:val="Footer Char"/>
+    <w:basedOn w:val="DefaultParagraphFont"/>
+    <w:link w:val="Footer"/>
+    <w:uiPriority w:val="99"/>
+    <w:rsid w:val="00A235BC"/>
+  </w:style>
 </w:styles>
 </file>
 

</xml_diff>